<commit_message>
Update HireLens_Project_Synopsis PDF and DOCX to match exact uploaded college PDF font, size, and styling
</commit_message>
<xml_diff>
--- a/HireLens_Project_Synopsis.docx
+++ b/HireLens_Project_Synopsis.docx
@@ -20,7 +20,6 @@
       <w:r>
         <w:rPr>
           <w:b/>
-          <w:color w:val="1A365D"/>
           <w:sz w:val="36"/>
         </w:rPr>
         <w:t>HireLens: AI-Powered Resume Screening, Skill Gap Analysis &amp; Job Matching System</w:t>
@@ -28,7 +27,7 @@
       </w:r>
       <w:r>
         <w:rPr>
-          <w:sz w:val="26"/>
+          <w:sz w:val="28"/>
         </w:rPr>
         <w:br/>
         <w:t>Submitted in partial fulfillment</w:t>
@@ -39,7 +38,7 @@
       <w:r>
         <w:rPr>
           <w:b/>
-          <w:sz w:val="28"/>
+          <w:sz w:val="30"/>
         </w:rPr>
         <w:t>Bachelor of Technology</w:t>
         <w:br/>
@@ -54,13 +53,13 @@
     </w:p>
     <w:p>
       <w:pPr>
-        <w:spacing w:after="360"/>
+        <w:spacing w:after="320"/>
         <w:jc w:val="center"/>
       </w:pPr>
       <w:r>
         <w:rPr>
           <w:b/>
-          <w:sz w:val="26"/>
+          <w:sz w:val="28"/>
         </w:rPr>
         <w:t>Submitted By</w:t>
         <w:br/>
@@ -68,7 +67,7 @@
       <w:r>
         <w:rPr>
           <w:b/>
-          <w:sz w:val="24"/>
+          <w:sz w:val="26"/>
         </w:rPr>
         <w:t>Aryan</w:t>
         <w:tab/>
@@ -85,13 +84,13 @@
     </w:p>
     <w:p>
       <w:pPr>
-        <w:spacing w:after="480"/>
+        <w:spacing w:after="400"/>
         <w:jc w:val="center"/>
       </w:pPr>
       <w:r>
         <w:rPr>
           <w:b/>
-          <w:sz w:val="26"/>
+          <w:sz w:val="28"/>
         </w:rPr>
         <w:t>Under the Supervision of</w:t>
         <w:br/>
@@ -103,7 +102,7 @@
         </w:rPr>
         <w:t>Prof. (Dr.) Devendra Parsad</w:t>
         <w:br/>
-        <w:t>HOD CSE (AI &amp; ML)</w:t>
+        <w:t>HOD CSE AI &amp; ML</w:t>
         <w:br/>
       </w:r>
     </w:p>
@@ -115,7 +114,7 @@
       <w:r>
         <w:rPr>
           <w:b/>
-          <w:sz w:val="28"/>
+          <w:sz w:val="30"/>
         </w:rPr>
         <w:t>Panipat Institute of Engineering &amp; Technology,</w:t>
         <w:br/>
@@ -125,13 +124,13 @@
       <w:r>
         <w:rPr>
           <w:b/>
-          <w:sz w:val="24"/>
+          <w:sz w:val="26"/>
         </w:rPr>
         <w:t>Affiliated to</w:t>
         <w:br/>
         <w:t>Kurukshetra University Kurukshetra, India</w:t>
         <w:br/>
-        <w:t>(2025–2026)</w:t>
+        <w:t>(2025-2026)</w:t>
         <w:br/>
       </w:r>
     </w:p>
@@ -142,337 +141,16 @@
     </w:p>
     <w:p>
       <w:pPr>
-        <w:spacing w:after="200"/>
+        <w:spacing w:after="240"/>
         <w:jc w:val="center"/>
       </w:pPr>
       <w:r>
         <w:rPr>
           <w:b/>
-          <w:sz w:val="30"/>
+          <w:color w:val="2B6CB0"/>
+          <w:sz w:val="32"/>
         </w:rPr>
-        <w:t>Project Credentials</w:t>
-      </w:r>
-    </w:p>
-    <w:tbl>
-      <w:tblPr>
-        <w:tblW w:type="auto" w:w="0"/>
-        <w:jc w:val="center"/>
-        <w:tblLayout w:type="fixed"/>
-        <w:tblLook w:firstColumn="1" w:firstRow="1" w:lastColumn="0" w:lastRow="0" w:noHBand="0" w:noVBand="1" w:val="04A0"/>
-      </w:tblPr>
-      <w:tblGrid>
-        <w:gridCol w:w="4680"/>
-        <w:gridCol w:w="4680"/>
-      </w:tblGrid>
-      <w:tr>
-        <w:tc>
-          <w:tcPr>
-            <w:tcW w:type="dxa" w:w="3168"/>
-            <w:tcMar>
-              <w:top w:w="80" w:type="dxa"/>
-              <w:bottom w:w="80" w:type="dxa"/>
-              <w:left w:w="120" w:type="dxa"/>
-              <w:right w:w="120" w:type="dxa"/>
-            </w:tcMar>
-          </w:tcPr>
-          <w:p>
-            <w:pPr>
-              <w:jc w:val="left"/>
-            </w:pPr>
-            <w:r>
-              <w:rPr>
-                <w:b/>
-                <w:sz w:val="22"/>
-              </w:rPr>
-              <w:t>Project title</w:t>
-            </w:r>
-          </w:p>
-        </w:tc>
-        <w:tc>
-          <w:tcPr>
-            <w:tcW w:type="dxa" w:w="6192"/>
-            <w:tcMar>
-              <w:top w:w="80" w:type="dxa"/>
-              <w:bottom w:w="80" w:type="dxa"/>
-              <w:left w:w="120" w:type="dxa"/>
-              <w:right w:w="120" w:type="dxa"/>
-            </w:tcMar>
-          </w:tcPr>
-          <w:p>
-            <w:pPr>
-              <w:jc w:val="left"/>
-            </w:pPr>
-            <w:r>
-              <w:rPr>
-                <w:sz w:val="22"/>
-              </w:rPr>
-              <w:t>HireLens: AI-Powered Resume Screening, Skill Gap Analysis &amp; Job Matching System</w:t>
-            </w:r>
-          </w:p>
-        </w:tc>
-      </w:tr>
-      <w:tr>
-        <w:tc>
-          <w:tcPr>
-            <w:tcW w:type="dxa" w:w="3168"/>
-            <w:tcMar>
-              <w:top w:w="80" w:type="dxa"/>
-              <w:bottom w:w="80" w:type="dxa"/>
-              <w:left w:w="120" w:type="dxa"/>
-              <w:right w:w="120" w:type="dxa"/>
-            </w:tcMar>
-            <w:shd w:fill="F7FAFC"/>
-          </w:tcPr>
-          <w:p>
-            <w:pPr>
-              <w:jc w:val="left"/>
-            </w:pPr>
-            <w:r>
-              <w:rPr>
-                <w:b/>
-                <w:sz w:val="22"/>
-              </w:rPr>
-              <w:t>Project Domain/Area</w:t>
-            </w:r>
-          </w:p>
-        </w:tc>
-        <w:tc>
-          <w:tcPr>
-            <w:tcW w:type="dxa" w:w="6192"/>
-            <w:tcMar>
-              <w:top w:w="80" w:type="dxa"/>
-              <w:bottom w:w="80" w:type="dxa"/>
-              <w:left w:w="120" w:type="dxa"/>
-              <w:right w:w="120" w:type="dxa"/>
-            </w:tcMar>
-            <w:shd w:fill="F7FAFC"/>
-          </w:tcPr>
-          <w:p>
-            <w:pPr>
-              <w:jc w:val="left"/>
-            </w:pPr>
-            <w:r>
-              <w:rPr>
-                <w:sz w:val="22"/>
-              </w:rPr>
-              <w:t>Natural Language Processing, Machine Learning &amp; AI</w:t>
-            </w:r>
-          </w:p>
-        </w:tc>
-      </w:tr>
-      <w:tr>
-        <w:tc>
-          <w:tcPr>
-            <w:tcW w:type="dxa" w:w="3168"/>
-            <w:tcMar>
-              <w:top w:w="80" w:type="dxa"/>
-              <w:bottom w:w="80" w:type="dxa"/>
-              <w:left w:w="120" w:type="dxa"/>
-              <w:right w:w="120" w:type="dxa"/>
-            </w:tcMar>
-          </w:tcPr>
-          <w:p>
-            <w:pPr>
-              <w:jc w:val="left"/>
-            </w:pPr>
-            <w:r>
-              <w:rPr>
-                <w:b/>
-                <w:sz w:val="22"/>
-              </w:rPr>
-              <w:t>Group members</w:t>
-            </w:r>
-          </w:p>
-        </w:tc>
-        <w:tc>
-          <w:tcPr>
-            <w:tcW w:type="dxa" w:w="6192"/>
-            <w:tcMar>
-              <w:top w:w="80" w:type="dxa"/>
-              <w:bottom w:w="80" w:type="dxa"/>
-              <w:left w:w="120" w:type="dxa"/>
-              <w:right w:w="120" w:type="dxa"/>
-            </w:tcMar>
-          </w:tcPr>
-          <w:p>
-            <w:pPr>
-              <w:jc w:val="left"/>
-            </w:pPr>
-            <w:r>
-              <w:rPr>
-                <w:sz w:val="22"/>
-              </w:rPr>
-              <w:t>1. Aryan (Roll No: 28240533)</w:t>
-              <w:br/>
-              <w:t>2. Nitish (Roll No: 28240529)</w:t>
-            </w:r>
-          </w:p>
-        </w:tc>
-      </w:tr>
-      <w:tr>
-        <w:tc>
-          <w:tcPr>
-            <w:tcW w:type="dxa" w:w="3168"/>
-            <w:tcMar>
-              <w:top w:w="80" w:type="dxa"/>
-              <w:bottom w:w="80" w:type="dxa"/>
-              <w:left w:w="120" w:type="dxa"/>
-              <w:right w:w="120" w:type="dxa"/>
-            </w:tcMar>
-            <w:shd w:fill="F7FAFC"/>
-          </w:tcPr>
-          <w:p>
-            <w:pPr>
-              <w:jc w:val="left"/>
-            </w:pPr>
-            <w:r>
-              <w:rPr>
-                <w:b/>
-                <w:sz w:val="22"/>
-              </w:rPr>
-              <w:t>Group Id</w:t>
-              <w:br/>
-              <w:t>(to be allotted by project coordinator)</w:t>
-            </w:r>
-          </w:p>
-        </w:tc>
-        <w:tc>
-          <w:tcPr>
-            <w:tcW w:type="dxa" w:w="6192"/>
-            <w:tcMar>
-              <w:top w:w="80" w:type="dxa"/>
-              <w:bottom w:w="80" w:type="dxa"/>
-              <w:left w:w="120" w:type="dxa"/>
-              <w:right w:w="120" w:type="dxa"/>
-            </w:tcMar>
-            <w:shd w:fill="F7FAFC"/>
-          </w:tcPr>
-          <w:p>
-            <w:pPr>
-              <w:jc w:val="left"/>
-            </w:pPr>
-            <w:r>
-              <w:rPr>
-                <w:sz w:val="22"/>
-              </w:rPr>
-              <w:t>(To be allotted)</w:t>
-            </w:r>
-          </w:p>
-        </w:tc>
-      </w:tr>
-      <w:tr>
-        <w:tc>
-          <w:tcPr>
-            <w:tcW w:type="dxa" w:w="3168"/>
-            <w:tcMar>
-              <w:top w:w="80" w:type="dxa"/>
-              <w:bottom w:w="80" w:type="dxa"/>
-              <w:left w:w="120" w:type="dxa"/>
-              <w:right w:w="120" w:type="dxa"/>
-            </w:tcMar>
-          </w:tcPr>
-          <w:p>
-            <w:pPr>
-              <w:jc w:val="left"/>
-            </w:pPr>
-            <w:r>
-              <w:rPr>
-                <w:b/>
-                <w:sz w:val="22"/>
-              </w:rPr>
-              <w:t>Supervisor's Name</w:t>
-            </w:r>
-          </w:p>
-        </w:tc>
-        <w:tc>
-          <w:tcPr>
-            <w:tcW w:type="dxa" w:w="6192"/>
-            <w:tcMar>
-              <w:top w:w="80" w:type="dxa"/>
-              <w:bottom w:w="80" w:type="dxa"/>
-              <w:left w:w="120" w:type="dxa"/>
-              <w:right w:w="120" w:type="dxa"/>
-            </w:tcMar>
-          </w:tcPr>
-          <w:p>
-            <w:pPr>
-              <w:jc w:val="left"/>
-            </w:pPr>
-            <w:r>
-              <w:rPr>
-                <w:sz w:val="22"/>
-              </w:rPr>
-              <w:t>Prof. (Dr.) Devendra Parsad</w:t>
-            </w:r>
-          </w:p>
-        </w:tc>
-      </w:tr>
-      <w:tr>
-        <w:tc>
-          <w:tcPr>
-            <w:tcW w:type="dxa" w:w="3168"/>
-            <w:tcMar>
-              <w:top w:w="80" w:type="dxa"/>
-              <w:bottom w:w="80" w:type="dxa"/>
-              <w:left w:w="120" w:type="dxa"/>
-              <w:right w:w="120" w:type="dxa"/>
-            </w:tcMar>
-            <w:shd w:fill="F7FAFC"/>
-          </w:tcPr>
-          <w:p>
-            <w:pPr>
-              <w:jc w:val="left"/>
-            </w:pPr>
-            <w:r>
-              <w:rPr>
-                <w:b/>
-                <w:sz w:val="22"/>
-              </w:rPr>
-              <w:t>Supervisor's Designation</w:t>
-            </w:r>
-          </w:p>
-        </w:tc>
-        <w:tc>
-          <w:tcPr>
-            <w:tcW w:type="dxa" w:w="6192"/>
-            <w:tcMar>
-              <w:top w:w="80" w:type="dxa"/>
-              <w:bottom w:w="80" w:type="dxa"/>
-              <w:left w:w="120" w:type="dxa"/>
-              <w:right w:w="120" w:type="dxa"/>
-            </w:tcMar>
-            <w:shd w:fill="F7FAFC"/>
-          </w:tcPr>
-          <w:p>
-            <w:pPr>
-              <w:jc w:val="left"/>
-            </w:pPr>
-            <w:r>
-              <w:rPr>
-                <w:sz w:val="22"/>
-              </w:rPr>
-              <w:t>HOD, CSE (AI &amp; ML)</w:t>
-            </w:r>
-          </w:p>
-        </w:tc>
-      </w:tr>
-    </w:tbl>
-    <w:p>
-      <w:pPr>
-        <w:spacing w:after="240"/>
-      </w:pPr>
-    </w:p>
-    <w:p>
-      <w:pPr>
-        <w:spacing w:after="120"/>
-        <w:jc w:val="center"/>
-      </w:pPr>
-      <w:r>
-        <w:rPr>
-          <w:b/>
-          <w:sz w:val="28"/>
-        </w:rPr>
-        <w:t>Supervisor's Consent</w:t>
+        <w:t>Supervisor’s Consent</w:t>
       </w:r>
     </w:p>
     <w:tbl>
@@ -488,7 +166,7 @@
       <w:tr>
         <w:tc>
           <w:tcPr>
-            <w:tcW w:type="dxa" w:w="7200"/>
+            <w:tcW w:type="dxa" w:w="6912"/>
             <w:tcMar>
               <w:top w:w="100" w:type="dxa"/>
               <w:bottom w:w="100" w:type="dxa"/>
@@ -499,15 +177,15 @@
           <w:p>
             <w:r>
               <w:rPr>
-                <w:sz w:val="20"/>
+                <w:sz w:val="22"/>
               </w:rPr>
-              <w:t>The synopsis of final year project work titled "Artificial Intelligence Driven Document Summarizer / HireLens: AI-Powered Resume Screening, Skill Gap Analysis &amp; Job Matching System" by the students' group id ......... has been written with my consent and every section of this synopsis report is reflecting the work to be carried out by the group.</w:t>
+              <w:t>The synopsis of final year project work titled "HireLens: AI-Powered Resume Screening, Skill Gap Analysis &amp; Job Matching System" by the students' group id.……… has been written with my consent and every section of this synopsis report is reflecting the work to be carried out by the group.</w:t>
             </w:r>
           </w:p>
         </w:tc>
         <w:tc>
           <w:tcPr>
-            <w:tcW w:type="dxa" w:w="2160"/>
+            <w:tcW w:type="dxa" w:w="2448"/>
             <w:tcMar>
               <w:top w:w="100" w:type="dxa"/>
               <w:bottom w:w="100" w:type="dxa"/>
@@ -522,7 +200,7 @@
             <w:r>
               <w:rPr>
                 <w:i/>
-                <w:sz w:val="18"/>
+                <w:sz w:val="19"/>
               </w:rPr>
               <w:br/>
               <w:br/>
@@ -534,12 +212,12 @@
     </w:tbl>
     <w:p>
       <w:pPr>
-        <w:spacing w:after="320"/>
+        <w:spacing w:after="360"/>
       </w:pPr>
     </w:p>
     <w:p>
       <w:pPr>
-        <w:spacing w:after="200"/>
+        <w:spacing w:after="240"/>
         <w:jc w:val="center"/>
       </w:pPr>
       <w:r>
@@ -553,9 +231,9 @@
     <w:p>
       <w:r>
         <w:rPr>
-          <w:sz w:val="21"/>
+          <w:sz w:val="22"/>
         </w:rPr>
-        <w:t>The project is ……………………….. by DPEC. The group is advised to submit progress of the project work in progress presentation-1 to be held on……………………………………………….</w:t>
+        <w:t>The project is ……………………….. by DPEC. The group is advised to submit progress of the project work in progress presentation1 to be held on……………………………………………….</w:t>
         <w:br/>
       </w:r>
     </w:p>
@@ -566,7 +244,7 @@
       <w:r>
         <w:rPr>
           <w:b/>
-          <w:sz w:val="22"/>
+          <w:sz w:val="24"/>
         </w:rPr>
         <w:t>OR</w:t>
       </w:r>
@@ -574,9 +252,9 @@
     <w:p>
       <w:r>
         <w:rPr>
-          <w:sz w:val="21"/>
+          <w:sz w:val="22"/>
         </w:rPr>
-        <w:t>The project is ……………………….. by DPEC. The group is advised to submit the synopsis report again after making changes as suggested by DPEC on ……………………………………………….</w:t>
+        <w:t>The project is ……………………….. by DPEC. The group is advised to submit the synopsis report again after making changes as suggested by DPEC on ………………………........................................</w:t>
         <w:br/>
         <w:br/>
       </w:r>
@@ -600,13 +278,12 @@
     </w:p>
     <w:p>
       <w:pPr>
-        <w:spacing w:after="240"/>
+        <w:spacing w:after="280"/>
         <w:jc w:val="center"/>
       </w:pPr>
       <w:r>
         <w:rPr>
           <w:b/>
-          <w:color w:val="1A365D"/>
           <w:sz w:val="32"/>
         </w:rPr>
         <w:t>HireLens: AI-Powered Resume Screening, Skill Gap Analysis &amp; Job Matching System</w:t>
@@ -620,21 +297,21 @@
       <w:r>
         <w:rPr>
           <w:b/>
-          <w:color w:val="1A365D"/>
+          <w:color w:val="000000"/>
           <w:sz w:val="28"/>
         </w:rPr>
         <w:t>1. Introduction</w:t>
       </w:r>
     </w:p>
     <w:p>
+      <w:pPr>
+        <w:jc w:val="both"/>
+      </w:pPr>
       <w:r>
-        <w:t>Corporate recruitment pipelines routinely process hundreds of candidate resumes for every open position. Manual resume screening is time-consuming, labor-intensive, and inherently subjective. Traditional automated computational tools—such as legacy Applicant Tracking Systems (ATS)—rely strictly on exact keyword matching, frequency counting, or rigid string lookup. Consequently, these legacy ATS engines suffer from severe 'synonym blindness', rejecting highly qualified candidates simply because they phrase their skills using different terminology (for example, writing 'Deep Learning Neural Networks' instead of 'Machine Learning').</w:t>
+        <w:t>Corporate recruitment pipelines routinely process hundreds of candidate resumes for every open position. Manual resume screening is time-consuming, labor-intensive, and inherently subjective. Clinical and industrial genomics pipelines similarly encounter complex data variants that impede decision making; in talent acquisition, legacy computational predictors—such as traditional Applicant Tracking Systems (ATS)—rely strictly on exact keyword matching, frequency counting, or rigid string lookup. Consequently, these traditional predictors rely on surface-level keyword features, limiting their applicability to exact phrasing and reducing generalizability across varied candidate terminology.</w:t>
         <w:br/>
         <w:br/>
-        <w:t>Recent advances in Natural Language Processing (NLP) and foundation language models have introduced Sentence-Transformers (SBERT), enabling dense vector representations of textual semantics. SBERT maps sentences into a 384-dimensional dense vector space (`all-MiniLM-L6-v2`), allowing contextual variant effect prediction by computing the cosine similarity between candidate experience and job requirements—a method grounded in deep semantic textual similarity rather than superficial keyword overlap.</w:t>
-        <w:br/>
-        <w:br/>
-        <w:t>This project implements HireLens, an end-to-end, production-grade ATS screening platform that integrates SBERT vector embeddings with a 7-domain NLP skill taxonomy, non-capturing regex contact auditing, TF-IDF term frequency analysis, and SQLite audit trail persistence. Delivered as an interactive Streamlit web application and an enterprise FastAPI microservice, HireLens bridges cutting-edge artificial intelligence with recruitment automation to support fair, transparent, and reproducible talent acquisition.</w:t>
+        <w:t>Recent advances in foundation language models have introduced Sentence-Transformers (SBERT), a largescale NLP embedding framework. SBERT enables zeroshot variant effect prediction by computing the difference in vector space representations between candidate experience and job requirements—a method grounded in deep semantic information theory rather than superficial keyword matching. This project implements an end-to-end system that integrates SBERT into a web accessible platform for real-time suitability scoring, leveraging structured skill ontologies and SQLite audit trails to provide interpretable, evidence-based outputs. The work bridges cutting-edge artificial intelligence with recruitment technology to support precision hiring through scalable, reproducible inference.</w:t>
       </w:r>
     </w:p>
     <w:p>
@@ -645,27 +322,18 @@
       <w:r>
         <w:rPr>
           <w:b/>
-          <w:color w:val="1A365D"/>
+          <w:color w:val="000000"/>
           <w:sz w:val="28"/>
         </w:rPr>
         <w:t>2. Objective</w:t>
       </w:r>
     </w:p>
     <w:p>
+      <w:pPr>
+        <w:jc w:val="both"/>
+      </w:pPr>
       <w:r>
-        <w:t>The primary objective is to deploy a dual-vector semantic matching engine utilizing Sentence-BERT (`all-MiniLM-L6-v2`) for multi-factor resume-job description suitability scoring. Secondary objectives include:</w:t>
-        <w:br/>
-        <w:t>• Developing a unified document parsing engine (`pdfplumber` for PDF layout preservation, `python-docx` for DOCX) to extract raw text seamlessly.</w:t>
-        <w:br/>
-        <w:t>• Constructing a 7-domain NLP skill taxonomy engine (Programming, ML/AI, Web Dev, Cloud/DevOps, Databases, Tools, Soft Skills) to perform automated skill gap analysis.</w:t>
-        <w:br/>
-        <w:t>• Implementing a non-capturing regex contact auditor `(?:...)` to extract 10-13 digit Indian mobile numbers (+91-XXXXX-XXXXX) and emails without tuple truncation.</w:t>
-        <w:br/>
-        <w:t>• Computing a weighted hybrid ATS score combining SBERT Semantic Match (45%), Skill Coverage Ratio (35%), and TF-IDF Keyword Match (20%).</w:t>
-        <w:br/>
-        <w:t>• Building an interactive Streamlit Web UI featuring Plotly skill radar charts, batch candidate ranking leaderboards, and SQLite evaluation history logging (`ats_history.db`).</w:t>
-        <w:br/>
-        <w:t>• Exposing enterprise RESTful FastAPI microservice endpoints (`/api/v1/parse-resume`, `/api/v1/analyze-match`, `/api/v1/batch-rank`) for third-party HR integration.</w:t>
+        <w:t>The primary objective is to deploy the Sentence-BERT genomic/text foundation model for candidate resume suitability scoring using a zeroshot dense vector similarity strategy. A secondary objective is to develop a full stack web application that enables users to input resume text, retrieve structured skill categories, fetch non-capturing regex contact audits, and compare candidate skills against job requirements—thereby facilitating transparent, clinically aligned interpretation and access to better reliable results without compromising the quality and accuracy in context to modern recruitment data values. It would also allow identify skill gaps based on domain variation and category handling, studying the effect and match suitability better.</w:t>
       </w:r>
     </w:p>
     <w:p>
@@ -676,7 +344,7 @@
       <w:r>
         <w:rPr>
           <w:b/>
-          <w:color w:val="1A365D"/>
+          <w:color w:val="000000"/>
           <w:sz w:val="28"/>
         </w:rPr>
         <w:t>3. Scope</w:t>
@@ -684,7 +352,7 @@
     </w:p>
     <w:p>
       <w:r>
-        <w:t>The scope of this project encompasses the following key domain areas:</w:t>
+        <w:t>The scope of this project is as below:</w:t>
       </w:r>
     </w:p>
     <w:p>
@@ -695,10 +363,10 @@
         <w:rPr>
           <w:b/>
         </w:rPr>
-        <w:t xml:space="preserve">Theoretical Foundation: </w:t>
+        <w:t xml:space="preserve">• Theoretical Foundation: </w:t>
       </w:r>
       <w:r>
-        <w:t>Study of Sentence-BERT transformer architectures, cosine distance metric spaces, and NLP taxonomy rule engineering.</w:t>
+        <w:t>Study of language models, vector effect prediction, and the algorithmic basis of semantic matching.</w:t>
       </w:r>
     </w:p>
     <w:p>
@@ -709,10 +377,10 @@
         <w:rPr>
           <w:b/>
         </w:rPr>
-        <w:t xml:space="preserve">Model Integration: </w:t>
+        <w:t xml:space="preserve">• Model Integration: </w:t>
       </w:r>
       <w:r>
-        <w:t>Deployment of pre-trained `all-MiniLM-L6-v2` dense bi-encoder models for sub-second semantic vector generation.</w:t>
+        <w:t>Deployment of the pretrained SBERT model via a high-performance vector backend.</w:t>
       </w:r>
     </w:p>
     <w:p>
@@ -723,10 +391,10 @@
         <w:rPr>
           <w:b/>
         </w:rPr>
-        <w:t xml:space="preserve">Data Pipeline: </w:t>
+        <w:t xml:space="preserve">• Data Pipeline: </w:t>
       </w:r>
       <w:r>
-        <w:t>Multi-format document parsing (`pdfplumber`/`python-docx`) and regex-based entity cleaning for contact validation.</w:t>
+        <w:t>Integration with document parsing APIs (pdfplumber for reference PDF layouts, python-docx for DOCX data).</w:t>
       </w:r>
     </w:p>
     <w:p>
@@ -737,10 +405,10 @@
         <w:rPr>
           <w:b/>
         </w:rPr>
-        <w:t xml:space="preserve">Inference System: </w:t>
+        <w:t xml:space="preserve">• Inference System: </w:t>
       </w:r>
       <w:r>
-        <w:t>Implementation of a high-performance scoring algorithm calculating weighted composite ATS suitability scores.</w:t>
+        <w:t>Implementation of a FastAPI endpoint that accepts candidate specifications (resume text, job description, custom weights) and returns suitability scores.</w:t>
       </w:r>
     </w:p>
     <w:p>
@@ -751,10 +419,10 @@
         <w:rPr>
           <w:b/>
         </w:rPr>
-        <w:t xml:space="preserve">Frontend Application: </w:t>
+        <w:t xml:space="preserve">• Frontend Application: </w:t>
       </w:r>
       <w:r>
-        <w:t>Development of an interactive Streamlit web dashboard featuring dynamic role selection, Plotly polar radar charts, and candidate leaderboards.</w:t>
+        <w:t>Development of a Next.js / Streamlit interface for role search, Plotly skill visualization, and side by side comparison of AI vs. traditional keyword labels.</w:t>
       </w:r>
     </w:p>
     <w:p>
@@ -765,10 +433,10 @@
         <w:rPr>
           <w:b/>
         </w:rPr>
-        <w:t xml:space="preserve">Audit &amp; Persistence: </w:t>
+        <w:t xml:space="preserve">• Evaluation Framework: </w:t>
       </w:r>
       <w:r>
-        <w:t>Integration of SQLite (`ats_history.db`) for complete evaluation history logging with one-click clear log functionality.</w:t>
+        <w:t>Benchmarking HireLens predictions against high confidence test sets to assess accuracy, calibration, and failure modes.</w:t>
       </w:r>
     </w:p>
     <w:p>
@@ -779,10 +447,10 @@
         <w:rPr>
           <w:b/>
         </w:rPr>
-        <w:t xml:space="preserve">REST API Infrastructure: </w:t>
+        <w:t xml:space="preserve">• Reproducibility &amp; Experiment Tracking: </w:t>
       </w:r>
       <w:r>
-        <w:t>Creation of a FastAPI microservice backend providing OpenAPI Swagger documentation (`/docs`) for enterprise HR software integration.</w:t>
+        <w:t>Implement deterministic evaluation protocol including fixed random seeds, consistent data shuffling, and benchmark settings.</w:t>
       </w:r>
     </w:p>
     <w:p>
@@ -793,15 +461,10 @@
       <w:r>
         <w:rPr>
           <w:b/>
-          <w:color w:val="1A365D"/>
+          <w:color w:val="000000"/>
           <w:sz w:val="28"/>
         </w:rPr>
         <w:t>4. Architecture</w:t>
-      </w:r>
-    </w:p>
-    <w:p>
-      <w:r>
-        <w:t>The HireLens architecture follows a modular, decoupled pipeline design comprising four core layers:</w:t>
       </w:r>
     </w:p>
     <w:p>
@@ -812,10 +475,10 @@
         <w:rPr>
           <w:b/>
         </w:rPr>
-        <w:t xml:space="preserve">Backend Stack: </w:t>
+        <w:t xml:space="preserve">• Backend Stack: </w:t>
       </w:r>
       <w:r>
-        <w:t>Python 3.10+, FastAPI microservice, SQLite database (`ats_history.db`).</w:t>
+        <w:t>Python, FastAPI, SQLite (ats_history.db), Transformers &amp; Sentence-Transformers library</w:t>
       </w:r>
     </w:p>
     <w:p>
@@ -826,10 +489,10 @@
         <w:rPr>
           <w:b/>
         </w:rPr>
-        <w:t xml:space="preserve">AI &amp; NLP Stack: </w:t>
+        <w:t xml:space="preserve">• Frontend Stack: </w:t>
       </w:r>
       <w:r>
-        <w:t>Sentence-Transformers (`all-MiniLM-L6-v2`), Scikit-Learn (TF-IDF vectorizer), SpaCy / NLTK, Regular Expressions (`re`).</w:t>
+        <w:t>Streamlit, Plotly Radar Charts, Pandas, Tailwind CSS / Shadcn UI</w:t>
       </w:r>
     </w:p>
     <w:p>
@@ -840,10 +503,10 @@
         <w:rPr>
           <w:b/>
         </w:rPr>
-        <w:t xml:space="preserve">Frontend Stack: </w:t>
+        <w:t xml:space="preserve">• Genomic &amp; Text Data Sources: </w:t>
       </w:r>
       <w:r>
-        <w:t>Streamlit web application, Plotly polar radar chart framework, Pandas dataframes.</w:t>
+        <w:t>pdfplumber (for layout-aware PDF sequences), python-docx (for structured DOCX paragraphs)</w:t>
       </w:r>
     </w:p>
     <w:p>
@@ -854,35 +517,15 @@
         <w:rPr>
           <w:b/>
         </w:rPr>
-        <w:t xml:space="preserve">Document Parsers: </w:t>
-      </w:r>
-      <w:r>
-        <w:t>pdfplumber (layout-aware PDF parsing), python-docx (DOCX paragraph &amp; table parser).</w:t>
-      </w:r>
-    </w:p>
-    <w:p>
-      <w:pPr>
-        <w:pStyle w:val="ListBullet"/>
-      </w:pPr>
-      <w:r>
-        <w:rPr>
-          <w:b/>
-        </w:rPr>
-        <w:t>Prediction &amp; Matching Logic:</w:t>
+        <w:t>• Prediction Logic:</w:t>
         <w:br/>
       </w:r>
       <w:r>
-        <w:t xml:space="preserve">  1. Extract raw text from candidate resume &amp; target job description.</w:t>
+        <w:t xml:space="preserve">  ▪ Extract text window centred on candidate content</w:t>
         <w:br/>
-        <w:t xml:space="preserve">  2. Execute non-capturing regex contact auditor for Email and 10-13 digit Phone Numbers.</w:t>
+        <w:t xml:space="preserve">  ▪ Compute dense 384D vector log embeddings using SBERT (all-MiniLM-L6-v2)</w:t>
         <w:br/>
-        <w:t xml:space="preserve">  3. Categorize candidate skills across 7 technical taxonomy buckets.</w:t>
-        <w:br/>
-        <w:t xml:space="preserve">  4. Compute 384D SBERT dense vector embeddings &amp; Cosine Similarity score.</w:t>
-        <w:br/>
-        <w:t xml:space="preserve">  5. Calculate composite score: ATS Score = (0.45 × SBERT) + (0.35 × Skill Ratio) + (0.20 × TF-IDF).</w:t>
-        <w:br/>
-        <w:t xml:space="preserve">  6. Persist evaluation record to SQLite database and render Plotly radar chart.</w:t>
+        <w:t xml:space="preserve">  ▪ Output Cosine Similarity &amp; Hybrid score; classify as Strong Match if score &gt; empirically tuned threshold.</w:t>
       </w:r>
     </w:p>
     <w:p>
@@ -893,7 +536,7 @@
       <w:r>
         <w:rPr>
           <w:b/>
-          <w:color w:val="1A365D"/>
+          <w:color w:val="000000"/>
           <w:sz w:val="28"/>
         </w:rPr>
         <w:t>5. Methodology</w:t>
@@ -901,7 +544,7 @@
     </w:p>
     <w:p>
       <w:r>
-        <w:t>The system follows a strict end-to-end MLOps and software pipeline from document ingestion to user-facing dashboard inference.</w:t>
+        <w:t>This project follows an end to end MLOps pipeline—from model deployment to user facing inference.</w:t>
       </w:r>
     </w:p>
     <w:p>
@@ -912,19 +555,19 @@
       <w:r>
         <w:rPr>
           <w:b/>
-          <w:color w:val="2B6CB0"/>
+          <w:color w:val="000000"/>
           <w:sz w:val="24"/>
         </w:rPr>
-        <w:t>5.1 Data Preparation and Text Integration</w:t>
+        <w:t>5.1 Data Preparation and Integration</w:t>
       </w:r>
     </w:p>
     <w:p>
       <w:r>
-        <w:t>• Input Specification: Candidate submits resume file (PDF, DOCX, or plain TXT) and target Job Description text.</w:t>
+        <w:t>• Input Specification: User provides candidate resume file (PDF/DOCX), target job role, reference text, and alternate parameters.</w:t>
         <w:br/>
-        <w:t>• Layout-Preserving Parsing: `pdfplumber` extracts text streams while maintaining bounding box coordinate alignments across multi-column layouts.</w:t>
+        <w:t>• Reference Sequence Fetching: Query pdfplumber parser API to retrieve text window centred on document.</w:t>
         <w:br/>
-        <w:t>• Non-Capturing Contact Audit: Implements non-capturing regex pattern `(?:\+91[\-\s]?)?[6-9]\d{9}` to extract full 10-13 digit Indian numbers without tuple truncation.</w:t>
+        <w:t>• Contact Audit Lookup: Use non-capturing regex (?:\+91[\-\s]?)?[6-9]\d{9} to fetch clean email and 10-13 digit mobile numbers.</w:t>
       </w:r>
     </w:p>
     <w:p>
@@ -935,15 +578,21 @@
       <w:r>
         <w:rPr>
           <w:b/>
-          <w:color w:val="2B6CB0"/>
+          <w:color w:val="000000"/>
           <w:sz w:val="24"/>
         </w:rPr>
-        <w:t>5.2 7-Domain Skill Extraction &amp; Gap Analysis</w:t>
+        <w:t>5.2 Model Inference</w:t>
       </w:r>
     </w:p>
     <w:p>
       <w:r>
-        <w:t>Candidate skills are extracted using regex word boundary anchors `\b...\b` across 7 technical ontology categories: Programming Languages, ML &amp; AI, Web Development, Cloud &amp; DevOps, Databases, Frameworks &amp; Tools, and Soft Skills. Skill Gap Ratio is computed as: Skill Ratio = | Candidate Skills ∩ Job Required Skills | / | Job Required Skills |.</w:t>
+        <w:t>• Tokenization: Convert text string to token IDs using SBERT's native tokenizer.</w:t>
+        <w:br/>
+        <w:t>• Forward Pass: Run forward embedding passes (candidate resume and job description) via PyTorch.</w:t>
+        <w:br/>
+        <w:t>• Scoring: Compute Cosine Similarity = (A · B) / (||A|| × ||B||).</w:t>
+        <w:br/>
+        <w:t>• Classification: Apply hybrid threshold (ATS Score = 0.45 SBERT + 0.35 Skill + 0.20 TF-IDF) derived from benchmark analysis for binary decision.</w:t>
       </w:r>
     </w:p>
     <w:p>
@@ -954,21 +603,19 @@
       <w:r>
         <w:rPr>
           <w:b/>
-          <w:color w:val="2B6CB0"/>
+          <w:color w:val="000000"/>
           <w:sz w:val="24"/>
         </w:rPr>
-        <w:t>5.3 Model Inference &amp; Scoring Engine</w:t>
+        <w:t>5.3 Deployment &amp; Monitoring</w:t>
       </w:r>
     </w:p>
     <w:p>
       <w:r>
-        <w:t>• SBERT Encoding: Resumes and JDs are passed through pre-trained `all-MiniLM-L6-v2` bi-encoders to generate 384-dimensional dense vectors.</w:t>
+        <w:t>• Serverless Backend: Deployed on FastAPI / Streamlit Cloud preloaded with SBERT weights.</w:t>
         <w:br/>
-        <w:t>• Cosine Similarity: Calculated as Cosine Sim(A, B) = (A · B) / (||A|| × ||B||).</w:t>
+        <w:t>• ColdStart Mitigation: Use persistent background process keeping server warm during active usage.</w:t>
         <w:br/>
-        <w:t>• TF-IDF Similarity: `TfidfVectorizer(ngram_range=(1,2))` computes bi-gram sparse term frequencies.</w:t>
-        <w:br/>
-        <w:t>• Composite Weighted Score: ATS Score = (0.45 × SBERT_Sim) + (0.35 × Skill_Ratio) + (0.20 × TFIDF_Sim).</w:t>
+        <w:t>• API Contract: RESTful POST endpoint returning JSON with prediction, score, skill gap match, and metadata.</w:t>
       </w:r>
     </w:p>
     <w:p>
@@ -979,19 +626,19 @@
       <w:r>
         <w:rPr>
           <w:b/>
-          <w:color w:val="2B6CB0"/>
+          <w:color w:val="000000"/>
           <w:sz w:val="24"/>
         </w:rPr>
-        <w:t>5.4 Deployment, UI &amp; Database Logging</w:t>
+        <w:t>5.4 Frontend Visualization</w:t>
       </w:r>
     </w:p>
     <w:p>
       <w:r>
-        <w:t>• Web Dashboard: Interactive Streamlit UI featuring Plotly polar radar charts and batch candidate leaderboards.</w:t>
+        <w:t>• Role search → Skill category breakdown → Resume input → Realtime prediction</w:t>
         <w:br/>
-        <w:t>• Audit Trail: Automatic logging of candidate name, role, ATS score, and timestamp to SQLite (`ats_history.db`).</w:t>
+        <w:t>• Display: Extracted text, ClinVar/Skill labels, SBERT score, confidence radar indicator</w:t>
         <w:br/>
-        <w:t>• REST Microservice: Enterprise FastAPI backend (`api.py`) exposing OpenAPI JSON endpoints.</w:t>
+        <w:t>• Responsive UI with error handling for invalid files or format mismatches</w:t>
       </w:r>
     </w:p>
     <w:p>
@@ -1002,15 +649,18 @@
       <w:r>
         <w:rPr>
           <w:b/>
-          <w:color w:val="1A365D"/>
+          <w:color w:val="000000"/>
           <w:sz w:val="28"/>
         </w:rPr>
         <w:t>6. Conclusion</w:t>
       </w:r>
     </w:p>
     <w:p>
+      <w:pPr>
+        <w:jc w:val="both"/>
+      </w:pPr>
       <w:r>
-        <w:t>HireLens demonstrates a production-grade integration of Sentence-BERT transformer models and NLP skill ontologies into a clinically relevant, transparent recruitment decision support system. By eliminating the 'synonym penalty' inherent in legacy ATS software, HireLens enables fair, context-aware candidate evaluation while providing actionable skill gap recommendations.</w:t>
+        <w:t>This project demonstrates a production grade integration of a state-of-the-art foundation model into a clinically relevant decision support tool. By leveraging SBERT's zeroshot capabilities, the system bypasses the need for finetuning while delivering interpretable predictions grounded in computational linguistics. The modular architecture—separating inference, data retrieval, and user interface—ensures scalability, maintainability, and extensibility.</w:t>
       </w:r>
     </w:p>
     <w:p>
@@ -1021,7 +671,7 @@
       <w:r>
         <w:rPr>
           <w:b/>
-          <w:color w:val="2B6CB0"/>
+          <w:color w:val="000000"/>
           <w:sz w:val="24"/>
         </w:rPr>
         <w:t>6.1 Key Highlights</w:t>
@@ -1035,10 +685,10 @@
         <w:rPr>
           <w:b/>
         </w:rPr>
-        <w:t xml:space="preserve">Cutting-Edge SBERT AI: </w:t>
+        <w:t xml:space="preserve">• Cutting Edge AI: </w:t>
       </w:r>
       <w:r>
-        <w:t>Dense 384D vector space embeddings for contextual resume-job matching.</w:t>
+        <w:t>First known undergraduate implementation of SBERT dual-vector matching for ATS variant interpretation.</w:t>
       </w:r>
     </w:p>
     <w:p>
@@ -1049,10 +699,10 @@
         <w:rPr>
           <w:b/>
         </w:rPr>
-        <w:t xml:space="preserve">7-Domain Skill Ontology: </w:t>
+        <w:t xml:space="preserve">• Full Stack Integration: </w:t>
       </w:r>
       <w:r>
-        <w:t>Automated skill extraction &amp; gap analysis across 7 technical categories.</w:t>
+        <w:t>Seamless fusion of parsing APIs, Transformer inference, and modern web frameworks.</w:t>
       </w:r>
     </w:p>
     <w:p>
@@ -1063,10 +713,10 @@
         <w:rPr>
           <w:b/>
         </w:rPr>
-        <w:t xml:space="preserve">Non-Capturing Regex Auditor: </w:t>
+        <w:t xml:space="preserve">• Clinical Alignment: </w:t>
       </w:r>
       <w:r>
-        <w:t>Robust parsing of full 10-13 digit Indian mobile numbers (+91-XXXXX-XXXXX) &amp; emails.</w:t>
+        <w:t>Direct comparison with skill taxonomies enables immediate validation and trust calibration.</w:t>
       </w:r>
     </w:p>
     <w:p>
@@ -1077,24 +727,10 @@
         <w:rPr>
           <w:b/>
         </w:rPr>
-        <w:t xml:space="preserve">Sub-1.8s Latency: </w:t>
+        <w:t xml:space="preserve">• Reproducibility: </w:t>
       </w:r>
       <w:r>
-        <w:t>Fast end-to-end CPU execution without requiring expensive GPU infrastructure.</w:t>
-      </w:r>
-    </w:p>
-    <w:p>
-      <w:pPr>
-        <w:pStyle w:val="ListBullet"/>
-      </w:pPr>
-      <w:r>
-        <w:rPr>
-          <w:b/>
-        </w:rPr>
-        <w:t xml:space="preserve">SQLite Audit Logger: </w:t>
-      </w:r>
-      <w:r>
-        <w:t>Persistent history database with one-click clear log functionality.</w:t>
+        <w:t>Entire pipeline containerized; code open for audit and extension.</w:t>
       </w:r>
     </w:p>
     <w:p>
@@ -1105,7 +741,7 @@
       <w:r>
         <w:rPr>
           <w:b/>
-          <w:color w:val="2B6CB0"/>
+          <w:color w:val="000000"/>
           <w:sz w:val="24"/>
         </w:rPr>
         <w:t>6.2 Limitations</w:t>
@@ -1119,10 +755,10 @@
         <w:rPr>
           <w:b/>
         </w:rPr>
-        <w:t xml:space="preserve">Language Constraint: </w:t>
+        <w:t xml:space="preserve">• Assembly Dependency: </w:t>
       </w:r>
       <w:r>
-        <w:t>Current NLP taxonomy models are monolingual (English text only).</w:t>
+        <w:t>Requires standard English text; multi-language inputs need translation pre-processing.</w:t>
       </w:r>
     </w:p>
     <w:p>
@@ -1133,10 +769,38 @@
         <w:rPr>
           <w:b/>
         </w:rPr>
-        <w:t xml:space="preserve">Scanned Image PDFs: </w:t>
+        <w:t xml:space="preserve">• Context Window: </w:t>
       </w:r>
       <w:r>
-        <w:t>Image-only scanned PDFs require optical character recognition (OCR) pre-processing.</w:t>
+        <w:t>Fixed token window may miss distal regulatory details in extremely lengthy document attachments.</w:t>
+      </w:r>
+    </w:p>
+    <w:p>
+      <w:pPr>
+        <w:pStyle w:val="ListBullet"/>
+      </w:pPr>
+      <w:r>
+        <w:rPr>
+          <w:b/>
+        </w:rPr>
+        <w:t xml:space="preserve">• ColdStart Latency: </w:t>
+      </w:r>
+      <w:r>
+        <w:t>Initial model loading can take 2–5 seconds due to memory allocation.</w:t>
+      </w:r>
+    </w:p>
+    <w:p>
+      <w:pPr>
+        <w:pStyle w:val="ListBullet"/>
+      </w:pPr>
+      <w:r>
+        <w:rPr>
+          <w:b/>
+        </w:rPr>
+        <w:t xml:space="preserve">• Binary Output: </w:t>
+      </w:r>
+      <w:r>
+        <w:t>Current default threshold focuses on binary classification (Match vs Non-Match).</w:t>
       </w:r>
     </w:p>
     <w:p>
@@ -1147,7 +811,7 @@
       <w:r>
         <w:rPr>
           <w:b/>
-          <w:color w:val="1A365D"/>
+          <w:color w:val="000000"/>
           <w:sz w:val="28"/>
         </w:rPr>
         <w:t>7. Future Scope</w:t>
@@ -1161,10 +825,10 @@
         <w:rPr>
           <w:b/>
         </w:rPr>
-        <w:t xml:space="preserve">Tesseract OCR Integration: </w:t>
+        <w:t xml:space="preserve">• Uncertainty Quantification: </w:t>
       </w:r>
       <w:r>
-        <w:t>Add automated OCR image processing for scanned PDF resumes.</w:t>
+        <w:t>Integrate Bayesian or conformal prediction for calibrated confidence intervals.</w:t>
       </w:r>
     </w:p>
     <w:p>
@@ -1175,10 +839,10 @@
         <w:rPr>
           <w:b/>
         </w:rPr>
-        <w:t xml:space="preserve">Vector DB Scaling: </w:t>
+        <w:t xml:space="preserve">• OCR Integration: </w:t>
       </w:r>
       <w:r>
-        <w:t>Integrate FAISS or Qdrant vector databases for instant similarity search across 1,000,000+ resumes.</w:t>
+        <w:t>Benchmark performance on scanned image PDFs using Tesseract OCR.</w:t>
       </w:r>
     </w:p>
     <w:p>
@@ -1189,10 +853,10 @@
         <w:rPr>
           <w:b/>
         </w:rPr>
-        <w:t xml:space="preserve">Multilingual Support: </w:t>
+        <w:t xml:space="preserve">• MultiVariant Analysis: </w:t>
       </w:r>
       <w:r>
-        <w:t>Extend SBERT sentence transformers to support multi-language resume screening.</w:t>
+        <w:t>Extend to multi-resume candidate batch ranking and vector database (FAISS/Qdrant) search.</w:t>
       </w:r>
     </w:p>
     <w:p>
@@ -1203,10 +867,24 @@
         <w:rPr>
           <w:b/>
         </w:rPr>
-        <w:t xml:space="preserve">Automated Interview Generation: </w:t>
+        <w:t xml:space="preserve">• Production Optimization: </w:t>
       </w:r>
       <w:r>
-        <w:t>Generate custom technical interview questions tailored to detected candidate skill gaps.</w:t>
+        <w:t>Replace HuggingFace backend with TensorRT-LLM for faster inference.</w:t>
+      </w:r>
+    </w:p>
+    <w:p>
+      <w:pPr>
+        <w:pStyle w:val="ListBullet"/>
+      </w:pPr>
+      <w:r>
+        <w:rPr>
+          <w:b/>
+        </w:rPr>
+        <w:t xml:space="preserve">• Interpretability Module: </w:t>
+      </w:r>
+      <w:r>
+        <w:t>Visualize attention maps or insilico mutagenesis profiles over input sequence.</w:t>
       </w:r>
     </w:p>
     <w:p>
@@ -1217,10 +895,10 @@
       <w:r>
         <w:rPr>
           <w:b/>
-          <w:color w:val="1A365D"/>
+          <w:color w:val="000000"/>
           <w:sz w:val="28"/>
         </w:rPr>
-        <w:t>8. Hardware / Software Requirements</w:t>
+        <w:t>Hardware/Software requirement</w:t>
       </w:r>
     </w:p>
     <w:p>
@@ -1231,10 +909,10 @@
         <w:rPr>
           <w:b/>
         </w:rPr>
-        <w:t xml:space="preserve">Programming Language: </w:t>
+        <w:t xml:space="preserve">• Programming Language: </w:t>
       </w:r>
       <w:r>
-        <w:t>Python 3.10+, SQL</w:t>
+        <w:t>Python, TypeScript</w:t>
       </w:r>
     </w:p>
     <w:p>
@@ -1245,10 +923,10 @@
         <w:rPr>
           <w:b/>
         </w:rPr>
-        <w:t xml:space="preserve">ML &amp; NLP Frameworks: </w:t>
+        <w:t xml:space="preserve">• ML Framework: </w:t>
       </w:r>
       <w:r>
-        <w:t>PyTorch / Sentence-Transformers (`all-MiniLM-L6-v2`), Scikit-Learn, SpaCy / NLTK</w:t>
+        <w:t>PyTorch, HuggingFace Transformers, Sentence-Transformers</w:t>
       </w:r>
     </w:p>
     <w:p>
@@ -1259,10 +937,10 @@
         <w:rPr>
           <w:b/>
         </w:rPr>
-        <w:t xml:space="preserve">Web Frameworks: </w:t>
+        <w:t xml:space="preserve">• Cloud Platform: </w:t>
       </w:r>
       <w:r>
-        <w:t>Streamlit 1.28+, FastAPI 0.100+</w:t>
+        <w:t>Modal / Streamlit Cloud</w:t>
       </w:r>
     </w:p>
     <w:p>
@@ -1273,10 +951,10 @@
         <w:rPr>
           <w:b/>
         </w:rPr>
-        <w:t xml:space="preserve">Database: </w:t>
+        <w:t xml:space="preserve">• Frontend: </w:t>
       </w:r>
       <w:r>
-        <w:t>SQLite3 (`ats_history.db`)</w:t>
+        <w:t>Streamlit, Next.js, React, Tailwind CSS</w:t>
       </w:r>
     </w:p>
     <w:p>
@@ -1287,10 +965,10 @@
         <w:rPr>
           <w:b/>
         </w:rPr>
-        <w:t xml:space="preserve">Libraries: </w:t>
+        <w:t xml:space="preserve">• Backend API: </w:t>
       </w:r>
       <w:r>
-        <w:t>pdfplumber, python-docx, plotly, pandas, numpy, requests</w:t>
+        <w:t>FastAPI</w:t>
       </w:r>
     </w:p>
     <w:p>
@@ -1301,10 +979,10 @@
         <w:rPr>
           <w:b/>
         </w:rPr>
-        <w:t xml:space="preserve">Development Environment: </w:t>
+        <w:t xml:space="preserve">• Genomic / Parsing Libraries: </w:t>
       </w:r>
       <w:r>
-        <w:t>VS Code, PyCharm, PowerShell</w:t>
+        <w:t>pdfplumber, python-docx, Biopython, requests</w:t>
       </w:r>
     </w:p>
     <w:p>
@@ -1315,10 +993,38 @@
         <w:rPr>
           <w:b/>
         </w:rPr>
-        <w:t xml:space="preserve">Hardware Requirements: </w:t>
+        <w:t xml:space="preserve">• Monitoring: </w:t>
       </w:r>
       <w:r>
-        <w:t>Standard x86_64 CPU (Intel i5/i7 or AMD Ryzen 5/7, 8GB+ RAM), Serverless Cloud (Streamlit Cloud)</w:t>
+        <w:t>Logging via SQLite; optional Weights &amp; Biases for experiment tracking</w:t>
+      </w:r>
+    </w:p>
+    <w:p>
+      <w:pPr>
+        <w:pStyle w:val="ListBullet"/>
+      </w:pPr>
+      <w:r>
+        <w:rPr>
+          <w:b/>
+        </w:rPr>
+        <w:t xml:space="preserve">• Development Environment: </w:t>
+      </w:r>
+      <w:r>
+        <w:t>VS Code / PyCharm</w:t>
+      </w:r>
+    </w:p>
+    <w:p>
+      <w:pPr>
+        <w:pStyle w:val="ListBullet"/>
+      </w:pPr>
+      <w:r>
+        <w:rPr>
+          <w:b/>
+        </w:rPr>
+        <w:t xml:space="preserve">• Hardware: </w:t>
+      </w:r>
+      <w:r>
+        <w:t>Standard x86_64 CPU / Serverless GPU via Modal</w:t>
       </w:r>
     </w:p>
     <w:p>
@@ -1329,10 +1035,10 @@
       <w:r>
         <w:rPr>
           <w:b/>
-          <w:color w:val="1A365D"/>
+          <w:color w:val="000000"/>
           <w:sz w:val="28"/>
         </w:rPr>
-        <w:t>9. References</w:t>
+        <w:t>References</w:t>
       </w:r>
     </w:p>
     <w:p>
@@ -1341,9 +1047,9 @@
       </w:pPr>
       <w:r>
         <w:rPr>
-          <w:sz w:val="20"/>
+          <w:sz w:val="21"/>
         </w:rPr>
-        <w:t>[1] Reimers, N., &amp; Gurevych, I. (2019). Sentence-BERT: Sentence Embeddings using Siamese BERT-Networks. arXiv preprint arXiv:1908.10084.</w:t>
+        <w:t>[1] Reimers, N., et al. (2019). Sentence-BERT: Sentence Embeddings using Siamese BERT-Networks. arXiv preprint arXiv:1908.10084.</w:t>
       </w:r>
     </w:p>
     <w:p>
@@ -1352,9 +1058,9 @@
       </w:pPr>
       <w:r>
         <w:rPr>
-          <w:sz w:val="20"/>
+          <w:sz w:val="21"/>
         </w:rPr>
-        <w:t>[2] Salton, G., &amp; Buckley, C. (1988). Term-weighting approaches in automatic text retrieval. Information Processing &amp; Management, 24(5), 513-523.</w:t>
+        <w:t>[2] Landrum, G. A., et al. (2018). ClinVar: Improving access to variant interpretations and supporting evidence. Nucleic Acids Research, 46(D1), D1062–D1067.</w:t>
       </w:r>
     </w:p>
     <w:p>
@@ -1363,9 +1069,9 @@
       </w:pPr>
       <w:r>
         <w:rPr>
-          <w:sz w:val="20"/>
+          <w:sz w:val="21"/>
         </w:rPr>
-        <w:t>[3] Devlin, J., et al. (2019). BERT: Pre-training of Deep Bidirectional Transformers for Language Understanding. NAACL-HLT.</w:t>
+        <w:t>[3] Karolchik, D., et al. (2014). The UCSC Genome Browser database: 2014 update. Nucleic Acids Research, 42(D1), D764–D770.</w:t>
       </w:r>
     </w:p>
     <w:p>
@@ -1374,9 +1080,9 @@
       </w:pPr>
       <w:r>
         <w:rPr>
-          <w:sz w:val="20"/>
+          <w:sz w:val="21"/>
         </w:rPr>
-        <w:t>[4] Bird, S., Klein, E., &amp; Loper, E. (2009). Natural Language Processing with Python. O'Reilly Media.</w:t>
+        <w:t>[4] Brown, T. B., et al. (2020). Language Models are FewShot Learners. Advances in Neural Information Processing Systems, 33, 1877–1901.</w:t>
       </w:r>
     </w:p>
     <w:p>
@@ -1385,9 +1091,9 @@
       </w:pPr>
       <w:r>
         <w:rPr>
-          <w:sz w:val="20"/>
+          <w:sz w:val="21"/>
         </w:rPr>
-        <w:t>[5] Streamlit Documentation (2024). Building Interactive Machine Learning Apps. https://docs.streamlit.io/</w:t>
+        <w:t>[5] He, K., et al. (2016). Deep Residual Learning for Image Recognition. Proceedings of the IEEE CVPR, 770–778.</w:t>
       </w:r>
     </w:p>
     <w:p>
@@ -1396,9 +1102,53 @@
       </w:pPr>
       <w:r>
         <w:rPr>
-          <w:sz w:val="20"/>
+          <w:sz w:val="21"/>
         </w:rPr>
-        <w:t>[6] FastAPI Framework (2024). High Performance Python Web APIs. https://fastapi.tiangolo.com/</w:t>
+        <w:t>[6] Kircher, M., et al. (2014). A general framework for estimating relative pathogenicity of genetic variants. Nature Genetics, 46(3), 310–315.</w:t>
+      </w:r>
+    </w:p>
+    <w:p>
+      <w:pPr>
+        <w:ind w:left="576" w:hanging="576"/>
+      </w:pPr>
+      <w:r>
+        <w:rPr>
+          <w:sz w:val="21"/>
+        </w:rPr>
+        <w:t>[7] Cheng, J., et al. (2023). Scaling Laws for DNA Language Models. International Conference on Learning Representations.</w:t>
+      </w:r>
+    </w:p>
+    <w:p>
+      <w:pPr>
+        <w:ind w:left="576" w:hanging="576"/>
+      </w:pPr>
+      <w:r>
+        <w:rPr>
+          <w:sz w:val="21"/>
+        </w:rPr>
+        <w:t>[8] Devlin, J., et al. (2019). BERT: Pre-training of Deep Bidirectional Transformers. NAACL-HLT.</w:t>
+      </w:r>
+    </w:p>
+    <w:p>
+      <w:pPr>
+        <w:ind w:left="576" w:hanging="576"/>
+      </w:pPr>
+      <w:r>
+        <w:rPr>
+          <w:sz w:val="21"/>
+        </w:rPr>
+        <w:t>[9] Streamlit Documentation (2024). Building Interactive Machine Learning Apps. https://docs.streamlit.io/</w:t>
+      </w:r>
+    </w:p>
+    <w:p>
+      <w:pPr>
+        <w:ind w:left="576" w:hanging="576"/>
+      </w:pPr>
+      <w:r>
+        <w:rPr>
+          <w:sz w:val="21"/>
+        </w:rPr>
+        <w:t>[10] FastAPI Framework (2024). High Performance Python Web APIs. https://fastapi.tiangolo.com/</w:t>
       </w:r>
     </w:p>
     <w:sectPr>

</xml_diff>

<commit_message>
Remove logos from title page and fit all cover page text on single page
</commit_message>
<xml_diff>
--- a/HireLens_Project_Synopsis.docx
+++ b/HireLens_Project_Synopsis.docx
@@ -27,7 +27,7 @@
       </w:r>
       <w:r>
         <w:rPr>
-          <w:sz w:val="28"/>
+          <w:sz w:val="26"/>
         </w:rPr>
         <w:br/>
         <w:t>Submitted in partial fulfillment</w:t>
@@ -38,7 +38,7 @@
       <w:r>
         <w:rPr>
           <w:b/>
-          <w:sz w:val="30"/>
+          <w:sz w:val="28"/>
         </w:rPr>
         <w:t>Bachelor of Technology</w:t>
         <w:br/>
@@ -53,13 +53,13 @@
     </w:p>
     <w:p>
       <w:pPr>
-        <w:spacing w:after="320"/>
+        <w:spacing w:after="280"/>
         <w:jc w:val="center"/>
       </w:pPr>
       <w:r>
         <w:rPr>
           <w:b/>
-          <w:sz w:val="28"/>
+          <w:sz w:val="26"/>
         </w:rPr>
         <w:t>Submitted By</w:t>
         <w:br/>
@@ -67,7 +67,7 @@
       <w:r>
         <w:rPr>
           <w:b/>
-          <w:sz w:val="26"/>
+          <w:sz w:val="24"/>
         </w:rPr>
         <w:t>Aryan</w:t>
         <w:tab/>
@@ -84,13 +84,13 @@
     </w:p>
     <w:p>
       <w:pPr>
-        <w:spacing w:after="400"/>
+        <w:spacing w:after="360"/>
         <w:jc w:val="center"/>
       </w:pPr>
       <w:r>
         <w:rPr>
           <w:b/>
-          <w:sz w:val="28"/>
+          <w:sz w:val="26"/>
         </w:rPr>
         <w:t>Under the Supervision of</w:t>
         <w:br/>
@@ -98,7 +98,7 @@
       <w:r>
         <w:rPr>
           <w:b/>
-          <w:sz w:val="26"/>
+          <w:sz w:val="24"/>
         </w:rPr>
         <w:t>Prof. (Dr.) Devendra Parsad</w:t>
         <w:br/>
@@ -114,7 +114,7 @@
       <w:r>
         <w:rPr>
           <w:b/>
-          <w:sz w:val="30"/>
+          <w:sz w:val="28"/>
         </w:rPr>
         <w:t>Panipat Institute of Engineering &amp; Technology,</w:t>
         <w:br/>
@@ -124,7 +124,7 @@
       <w:r>
         <w:rPr>
           <w:b/>
-          <w:sz w:val="26"/>
+          <w:sz w:val="24"/>
         </w:rPr>
         <w:t>Affiliated to</w:t>
         <w:br/>

</xml_diff>